<commit_message>
add using of env-var S3ResultOutputPath and MaxImageAspectRatioPercentageDifference, change some logging, code refactoring
</commit_message>
<xml_diff>
--- a/documents/Benutzerhandbuch.docx
+++ b/documents/Benutzerhandbuch.docx
@@ -97,145 +97,6 @@
       <w:proofErr w:type="spellEnd"/>
       <w:r>
         <w:t xml:space="preserve"> Environment (JRE): Version 21 oder höher.</w:t>
-      </w:r>
-    </w:p>
-    <w:p>
-      <w:pPr>
-        <w:pStyle w:val="Listenabsatz"/>
-        <w:numPr>
-          <w:ilvl w:val="0"/>
-          <w:numId w:val="20"/>
-        </w:numPr>
-      </w:pPr>
-      <w:r>
-        <w:t>Maven: (Optional) Nur erforderlich, wenn Sie die Anwendung aus dem Quellcode selbst erstellen möchten.</w:t>
-      </w:r>
-    </w:p>
-    <w:p>
-      <w:pPr>
-        <w:pStyle w:val="berschrift1"/>
-      </w:pPr>
-      <w:r>
-        <w:t xml:space="preserve">Installation &amp; </w:t>
-      </w:r>
-      <w:proofErr w:type="spellStart"/>
-      <w:r>
-        <w:t>Build</w:t>
-      </w:r>
-      <w:proofErr w:type="spellEnd"/>
-    </w:p>
-    <w:p>
-      <w:r>
-        <w:t>Um die Anwendung aus dem Quellcode zu erstellen:</w:t>
-      </w:r>
-    </w:p>
-    <w:p>
-      <w:pPr>
-        <w:pStyle w:val="Listenabsatz"/>
-        <w:numPr>
-          <w:ilvl w:val="0"/>
-          <w:numId w:val="19"/>
-        </w:numPr>
-      </w:pPr>
-      <w:r>
-        <w:t>Öffnen Sie Ihr</w:t>
-      </w:r>
-      <w:r>
-        <w:t>/e</w:t>
-      </w:r>
-      <w:r>
-        <w:t xml:space="preserve"> Terminal/Kommandozeile.</w:t>
-      </w:r>
-    </w:p>
-    <w:p>
-      <w:pPr>
-        <w:pStyle w:val="Listenabsatz"/>
-        <w:numPr>
-          <w:ilvl w:val="0"/>
-          <w:numId w:val="19"/>
-        </w:numPr>
-      </w:pPr>
-      <w:r>
-        <w:t>Navigieren Sie in das Hauptverzeichnis des Projekt</w:t>
-      </w:r>
-      <w:r>
-        <w:t>e</w:t>
-      </w:r>
-      <w:r>
-        <w:t>s.</w:t>
-      </w:r>
-    </w:p>
-    <w:p>
-      <w:pPr>
-        <w:pStyle w:val="Listenabsatz"/>
-        <w:numPr>
-          <w:ilvl w:val="0"/>
-          <w:numId w:val="19"/>
-        </w:numPr>
-      </w:pPr>
-      <w:r>
-        <w:t xml:space="preserve">Führen Sie den folgenden Befehl aus: </w:t>
-      </w:r>
-    </w:p>
-    <w:p>
-      <w:pPr>
-        <w:pStyle w:val="Listenabsatz"/>
-      </w:pPr>
-      <w:proofErr w:type="spellStart"/>
-      <w:r>
-        <w:rPr>
-          <w:rStyle w:val="IntensiveHervorhebung"/>
-        </w:rPr>
-        <w:t>mvn</w:t>
-      </w:r>
-      <w:proofErr w:type="spellEnd"/>
-      <w:r>
-        <w:rPr>
-          <w:rStyle w:val="IntensiveHervorhebung"/>
-        </w:rPr>
-        <w:t xml:space="preserve"> clean </w:t>
-      </w:r>
-      <w:proofErr w:type="spellStart"/>
-      <w:r>
-        <w:rPr>
-          <w:rStyle w:val="IntensiveHervorhebung"/>
-        </w:rPr>
-        <w:t>package</w:t>
-      </w:r>
-      <w:proofErr w:type="spellEnd"/>
-      <w:r>
-        <w:rPr>
-          <w:rStyle w:val="IntensiveHervorhebung"/>
-        </w:rPr>
-        <w:t xml:space="preserve"> -</w:t>
-      </w:r>
-      <w:proofErr w:type="spellStart"/>
-      <w:r>
-        <w:rPr>
-          <w:rStyle w:val="IntensiveHervorhebung"/>
-        </w:rPr>
-        <w:t>DskipTests</w:t>
-      </w:r>
-      <w:proofErr w:type="spellEnd"/>
-    </w:p>
-    <w:p>
-      <w:pPr>
-        <w:pStyle w:val="Listenabsatz"/>
-        <w:numPr>
-          <w:ilvl w:val="0"/>
-          <w:numId w:val="19"/>
-        </w:numPr>
-      </w:pPr>
-      <w:r>
-        <w:t xml:space="preserve">Die fertige Datei (oereb-checker-1.0-jar-with-dependencies.jar) finden Sie danach im Unterordner </w:t>
-      </w:r>
-      <w:proofErr w:type="spellStart"/>
-      <w:r>
-        <w:t>target</w:t>
-      </w:r>
-      <w:proofErr w:type="spellEnd"/>
-      <w:r>
-        <w:t>/.</w:t>
       </w:r>
     </w:p>
     <w:p>
@@ -409,6 +270,7 @@
           <w:lang w:val="fr-CH"/>
         </w:rPr>
       </w:pPr>
+      <w:proofErr w:type="gramStart"/>
       <w:r>
         <w:rPr>
           <w:rStyle w:val="IntensiveHervorhebung"/>
@@ -416,7 +278,17 @@
           <w:szCs w:val="20"/>
           <w:lang w:val="fr-CH"/>
         </w:rPr>
-        <w:t xml:space="preserve">java -jar oereb-checker.jar -canton </w:t>
+        <w:t>java</w:t>
+      </w:r>
+      <w:proofErr w:type="gramEnd"/>
+      <w:r>
+        <w:rPr>
+          <w:rStyle w:val="IntensiveHervorhebung"/>
+          <w:sz w:val="20"/>
+          <w:szCs w:val="20"/>
+          <w:lang w:val="fr-CH"/>
+        </w:rPr>
+        <w:t xml:space="preserve"> -jar oereb-checker.jar -canton </w:t>
       </w:r>
       <w:r>
         <w:rPr>
@@ -503,6 +375,7 @@
         <w:t>Kommandozeilenparameter</w:t>
       </w:r>
     </w:p>
+    <w:p/>
     <w:p>
       <w:pPr>
         <w:pStyle w:val="berschrift2"/>
@@ -676,7 +549,12 @@
     </w:tbl>
     <w:p>
       <w:pPr>
-        <w:pStyle w:val="Untertitel"/>
+        <w:pStyle w:val="berschrift2"/>
+        <w:numPr>
+          <w:ilvl w:val="0"/>
+          <w:numId w:val="0"/>
+        </w:numPr>
+        <w:ind w:left="576" w:hanging="576"/>
       </w:pPr>
     </w:p>
     <w:p>
@@ -684,7 +562,6 @@
         <w:pStyle w:val="berschrift2"/>
       </w:pPr>
       <w:r>
-        <w:lastRenderedPageBreak/>
         <w:t>Parameter für Direkt-Prüfungen</w:t>
       </w:r>
     </w:p>
@@ -695,8 +572,8 @@
         <w:tblLook w:val="04A0" w:firstRow="1" w:lastRow="0" w:firstColumn="1" w:lastColumn="0" w:noHBand="0" w:noVBand="1"/>
       </w:tblPr>
       <w:tblGrid>
-        <w:gridCol w:w="1980"/>
-        <w:gridCol w:w="6946"/>
+        <w:gridCol w:w="2122"/>
+        <w:gridCol w:w="6804"/>
       </w:tblGrid>
       <w:tr>
         <w:trPr>
@@ -705,7 +582,7 @@
         <w:tc>
           <w:tcPr>
             <w:cnfStyle w:val="001000000000" w:firstRow="0" w:lastRow="0" w:firstColumn="1" w:lastColumn="0" w:oddVBand="0" w:evenVBand="0" w:oddHBand="0" w:evenHBand="0" w:firstRowFirstColumn="0" w:firstRowLastColumn="0" w:lastRowFirstColumn="0" w:lastRowLastColumn="0"/>
-            <w:tcW w:w="1980" w:type="dxa"/>
+            <w:tcW w:w="2122" w:type="dxa"/>
             <w:hideMark/>
           </w:tcPr>
           <w:p>
@@ -716,7 +593,7 @@
         </w:tc>
         <w:tc>
           <w:tcPr>
-            <w:tcW w:w="6946" w:type="dxa"/>
+            <w:tcW w:w="6804" w:type="dxa"/>
             <w:hideMark/>
           </w:tcPr>
           <w:p>
@@ -733,7 +610,7 @@
         <w:tc>
           <w:tcPr>
             <w:cnfStyle w:val="001000000000" w:firstRow="0" w:lastRow="0" w:firstColumn="1" w:lastColumn="0" w:oddVBand="0" w:evenVBand="0" w:oddHBand="0" w:evenHBand="0" w:firstRowFirstColumn="0" w:firstRowLastColumn="0" w:lastRowFirstColumn="0" w:lastRowLastColumn="0"/>
-            <w:tcW w:w="1980" w:type="dxa"/>
+            <w:tcW w:w="2122" w:type="dxa"/>
             <w:hideMark/>
           </w:tcPr>
           <w:p>
@@ -752,7 +629,7 @@
         </w:tc>
         <w:tc>
           <w:tcPr>
-            <w:tcW w:w="6946" w:type="dxa"/>
+            <w:tcW w:w="6804" w:type="dxa"/>
             <w:hideMark/>
           </w:tcPr>
           <w:p>
@@ -780,7 +657,7 @@
         <w:tc>
           <w:tcPr>
             <w:cnfStyle w:val="001000000000" w:firstRow="0" w:lastRow="0" w:firstColumn="1" w:lastColumn="0" w:oddVBand="0" w:evenVBand="0" w:oddHBand="0" w:evenHBand="0" w:firstRowFirstColumn="0" w:firstRowLastColumn="0" w:lastRowFirstColumn="0" w:lastRowLastColumn="0"/>
-            <w:tcW w:w="1980" w:type="dxa"/>
+            <w:tcW w:w="2122" w:type="dxa"/>
             <w:hideMark/>
           </w:tcPr>
           <w:p>
@@ -807,7 +684,7 @@
         </w:tc>
         <w:tc>
           <w:tcPr>
-            <w:tcW w:w="6946" w:type="dxa"/>
+            <w:tcW w:w="6804" w:type="dxa"/>
             <w:hideMark/>
           </w:tcPr>
           <w:p>
@@ -824,7 +701,7 @@
         <w:tc>
           <w:tcPr>
             <w:cnfStyle w:val="001000000000" w:firstRow="0" w:lastRow="0" w:firstColumn="1" w:lastColumn="0" w:oddVBand="0" w:evenVBand="0" w:oddHBand="0" w:evenHBand="0" w:firstRowFirstColumn="0" w:firstRowLastColumn="0" w:lastRowFirstColumn="0" w:lastRowLastColumn="0"/>
-            <w:tcW w:w="1980" w:type="dxa"/>
+            <w:tcW w:w="2122" w:type="dxa"/>
             <w:hideMark/>
           </w:tcPr>
           <w:p>
@@ -835,7 +712,7 @@
         </w:tc>
         <w:tc>
           <w:tcPr>
-            <w:tcW w:w="6946" w:type="dxa"/>
+            <w:tcW w:w="6804" w:type="dxa"/>
             <w:hideMark/>
           </w:tcPr>
           <w:p>
@@ -884,7 +761,7 @@
         <w:tc>
           <w:tcPr>
             <w:cnfStyle w:val="001000000000" w:firstRow="0" w:lastRow="0" w:firstColumn="1" w:lastColumn="0" w:oddVBand="0" w:evenVBand="0" w:oddHBand="0" w:evenHBand="0" w:firstRowFirstColumn="0" w:firstRowLastColumn="0" w:lastRowFirstColumn="0" w:lastRowLastColumn="0"/>
-            <w:tcW w:w="1980" w:type="dxa"/>
+            <w:tcW w:w="2122" w:type="dxa"/>
             <w:hideMark/>
           </w:tcPr>
           <w:p>
@@ -903,7 +780,7 @@
         </w:tc>
         <w:tc>
           <w:tcPr>
-            <w:tcW w:w="6946" w:type="dxa"/>
+            <w:tcW w:w="6804" w:type="dxa"/>
             <w:hideMark/>
           </w:tcPr>
           <w:p>
@@ -944,7 +821,7 @@
         <w:tc>
           <w:tcPr>
             <w:cnfStyle w:val="001000000000" w:firstRow="0" w:lastRow="0" w:firstColumn="1" w:lastColumn="0" w:oddVBand="0" w:evenVBand="0" w:oddHBand="0" w:evenHBand="0" w:firstRowFirstColumn="0" w:firstRowLastColumn="0" w:lastRowFirstColumn="0" w:lastRowLastColumn="0"/>
-            <w:tcW w:w="1980" w:type="dxa"/>
+            <w:tcW w:w="2122" w:type="dxa"/>
             <w:hideMark/>
           </w:tcPr>
           <w:p>
@@ -963,7 +840,7 @@
         </w:tc>
         <w:tc>
           <w:tcPr>
-            <w:tcW w:w="6946" w:type="dxa"/>
+            <w:tcW w:w="6804" w:type="dxa"/>
             <w:hideMark/>
           </w:tcPr>
           <w:p>
@@ -976,13 +853,50 @@
           </w:p>
         </w:tc>
       </w:tr>
+      <w:tr>
+        <w:tc>
+          <w:tcPr>
+            <w:cnfStyle w:val="001000000000" w:firstRow="0" w:lastRow="0" w:firstColumn="1" w:lastColumn="0" w:oddVBand="0" w:evenVBand="0" w:oddHBand="0" w:evenHBand="0" w:firstRowFirstColumn="0" w:firstRowLastColumn="0" w:lastRowFirstColumn="0" w:lastRowLastColumn="0"/>
+            <w:tcW w:w="2122" w:type="dxa"/>
+          </w:tcPr>
+          <w:p>
+            <w:r>
+              <w:t>-provoke500</w:t>
+            </w:r>
+            <w:r>
+              <w:t>[</w:t>
+            </w:r>
+            <w:proofErr w:type="spellStart"/>
+            <w:r>
+              <w:t>bool</w:t>
+            </w:r>
+            <w:proofErr w:type="spellEnd"/>
+            <w:r>
+              <w:t>]</w:t>
+            </w:r>
+          </w:p>
+        </w:tc>
+        <w:tc>
+          <w:tcPr>
+            <w:tcW w:w="6804" w:type="dxa"/>
+          </w:tcPr>
+          <w:p>
+            <w:pPr>
+              <w:cnfStyle w:val="000000000000" w:firstRow="0" w:lastRow="0" w:firstColumn="0" w:lastColumn="0" w:oddVBand="0" w:evenVBand="0" w:oddHBand="0" w:evenHBand="0" w:firstRowFirstColumn="0" w:firstRowLastColumn="0" w:lastRowFirstColumn="0" w:lastRowLastColumn="0"/>
+            </w:pPr>
+            <w:r>
+              <w:t>Lösen Sie absichtlich einen Serverfehler aus, indem Sie ein ungültiges Format anfordern (wahr/falsch).</w:t>
+            </w:r>
+          </w:p>
+        </w:tc>
+      </w:tr>
     </w:tbl>
-    <w:p/>
     <w:p>
       <w:pPr>
         <w:pStyle w:val="berschrift2"/>
       </w:pPr>
       <w:r>
+        <w:lastRenderedPageBreak/>
         <w:t>Spezifische Abfrage-Parameter</w:t>
       </w:r>
     </w:p>
@@ -1189,7 +1103,9 @@
           <w:numId w:val="18"/>
         </w:numPr>
         <w:rPr>
-          <w:rStyle w:val="IntensiveHervorhebung"/>
+          <w:i/>
+          <w:iCs/>
+          <w:color w:val="0F4761" w:themeColor="accent1" w:themeShade="BF"/>
         </w:rPr>
       </w:pPr>
       <w:r>
@@ -1198,448 +1114,6 @@
         </w:rPr>
         <w:t>-IDENTDN -NUMBER</w:t>
       </w:r>
-    </w:p>
-    <w:p>
-      <w:pPr>
-        <w:pStyle w:val="berschrift1"/>
-      </w:pPr>
-      <w:r>
-        <w:t>Nutzung mit Docker</w:t>
-      </w:r>
-    </w:p>
-    <w:p>
-      <w:r>
-        <w:t>Falls Sie Docker bevorzugen, können Sie das Tool wie folgt nutzen:</w:t>
-      </w:r>
-    </w:p>
-    <w:p>
-      <w:pPr>
-        <w:pStyle w:val="Listenabsatz"/>
-        <w:numPr>
-          <w:ilvl w:val="0"/>
-          <w:numId w:val="27"/>
-        </w:numPr>
-      </w:pPr>
-      <w:r>
-        <w:t>Image erstellen:</w:t>
-      </w:r>
-      <w:r>
-        <w:t xml:space="preserve"> </w:t>
-      </w:r>
-    </w:p>
-    <w:p>
-      <w:pPr>
-        <w:pStyle w:val="Listenabsatz"/>
-        <w:ind w:left="1440"/>
-      </w:pPr>
-      <w:proofErr w:type="spellStart"/>
-      <w:r>
-        <w:rPr>
-          <w:rStyle w:val="IntensiveHervorhebung"/>
-        </w:rPr>
-        <w:t>docker</w:t>
-      </w:r>
-      <w:proofErr w:type="spellEnd"/>
-      <w:r>
-        <w:rPr>
-          <w:rStyle w:val="IntensiveHervorhebung"/>
-        </w:rPr>
-        <w:t xml:space="preserve"> </w:t>
-      </w:r>
-      <w:proofErr w:type="spellStart"/>
-      <w:r>
-        <w:rPr>
-          <w:rStyle w:val="IntensiveHervorhebung"/>
-        </w:rPr>
-        <w:t>build</w:t>
-      </w:r>
-      <w:proofErr w:type="spellEnd"/>
-      <w:r>
-        <w:rPr>
-          <w:rStyle w:val="IntensiveHervorhebung"/>
-        </w:rPr>
-        <w:t xml:space="preserve"> -t </w:t>
-      </w:r>
-      <w:proofErr w:type="spellStart"/>
-      <w:r>
-        <w:rPr>
-          <w:rStyle w:val="IntensiveHervorhebung"/>
-        </w:rPr>
-        <w:t>oereb-checker</w:t>
-      </w:r>
-      <w:proofErr w:type="spellEnd"/>
-      <w:r>
-        <w:rPr>
-          <w:rStyle w:val="IntensiveHervorhebung"/>
-        </w:rPr>
-        <w:t xml:space="preserve"> </w:t>
-      </w:r>
-    </w:p>
-    <w:p>
-      <w:pPr>
-        <w:pStyle w:val="Listenabsatz"/>
-        <w:numPr>
-          <w:ilvl w:val="0"/>
-          <w:numId w:val="27"/>
-        </w:numPr>
-      </w:pPr>
-      <w:r>
-        <w:t xml:space="preserve">Container ausführen (mit lokaler Ergebnisspeicherung): </w:t>
-      </w:r>
-    </w:p>
-    <w:p>
-      <w:pPr>
-        <w:pStyle w:val="Listenabsatz"/>
-        <w:ind w:left="1440"/>
-        <w:rPr>
-          <w:rStyle w:val="IntensiveHervorhebung"/>
-          <w:sz w:val="20"/>
-          <w:szCs w:val="20"/>
-        </w:rPr>
-      </w:pPr>
-      <w:proofErr w:type="spellStart"/>
-      <w:r>
-        <w:rPr>
-          <w:rStyle w:val="IntensiveHervorhebung"/>
-          <w:sz w:val="20"/>
-          <w:szCs w:val="20"/>
-        </w:rPr>
-        <w:t>docker</w:t>
-      </w:r>
-      <w:proofErr w:type="spellEnd"/>
-      <w:r>
-        <w:rPr>
-          <w:rStyle w:val="IntensiveHervorhebung"/>
-          <w:sz w:val="20"/>
-          <w:szCs w:val="20"/>
-        </w:rPr>
-        <w:t xml:space="preserve"> </w:t>
-      </w:r>
-      <w:proofErr w:type="spellStart"/>
-      <w:r>
-        <w:rPr>
-          <w:rStyle w:val="IntensiveHervorhebung"/>
-          <w:sz w:val="20"/>
-          <w:szCs w:val="20"/>
-        </w:rPr>
-        <w:t>run</w:t>
-      </w:r>
-      <w:proofErr w:type="spellEnd"/>
-      <w:r>
-        <w:rPr>
-          <w:rStyle w:val="IntensiveHervorhebung"/>
-          <w:sz w:val="20"/>
-          <w:szCs w:val="20"/>
-        </w:rPr>
-        <w:t xml:space="preserve"> -v $(</w:t>
-      </w:r>
-      <w:proofErr w:type="spellStart"/>
-      <w:r>
-        <w:rPr>
-          <w:rStyle w:val="IntensiveHervorhebung"/>
-          <w:sz w:val="20"/>
-          <w:szCs w:val="20"/>
-        </w:rPr>
-        <w:t>pwd</w:t>
-      </w:r>
-      <w:proofErr w:type="spellEnd"/>
-      <w:r>
-        <w:rPr>
-          <w:rStyle w:val="IntensiveHervorhebung"/>
-          <w:sz w:val="20"/>
-          <w:szCs w:val="20"/>
-        </w:rPr>
-        <w:t>)/</w:t>
-      </w:r>
-      <w:proofErr w:type="spellStart"/>
-      <w:r>
-        <w:rPr>
-          <w:rStyle w:val="IntensiveHervorhebung"/>
-          <w:sz w:val="20"/>
-          <w:szCs w:val="20"/>
-        </w:rPr>
-        <w:t>output</w:t>
-      </w:r>
-      <w:proofErr w:type="spellEnd"/>
-      <w:r>
-        <w:rPr>
-          <w:rStyle w:val="IntensiveHervorhebung"/>
-          <w:sz w:val="20"/>
-          <w:szCs w:val="20"/>
-        </w:rPr>
-        <w:t>:/</w:t>
-      </w:r>
-      <w:proofErr w:type="spellStart"/>
-      <w:r>
-        <w:rPr>
-          <w:rStyle w:val="IntensiveHervorhebung"/>
-          <w:sz w:val="20"/>
-          <w:szCs w:val="20"/>
-        </w:rPr>
-        <w:t>app</w:t>
-      </w:r>
-      <w:proofErr w:type="spellEnd"/>
-      <w:r>
-        <w:rPr>
-          <w:rStyle w:val="IntensiveHervorhebung"/>
-          <w:sz w:val="20"/>
-          <w:szCs w:val="20"/>
-        </w:rPr>
-        <w:t>/</w:t>
-      </w:r>
-      <w:proofErr w:type="spellStart"/>
-      <w:r>
-        <w:rPr>
-          <w:rStyle w:val="IntensiveHervorhebung"/>
-          <w:sz w:val="20"/>
-          <w:szCs w:val="20"/>
-        </w:rPr>
-        <w:t>output</w:t>
-      </w:r>
-      <w:proofErr w:type="spellEnd"/>
-      <w:r>
-        <w:rPr>
-          <w:rStyle w:val="IntensiveHervorhebung"/>
-          <w:sz w:val="20"/>
-          <w:szCs w:val="20"/>
-        </w:rPr>
-        <w:t xml:space="preserve"> </w:t>
-      </w:r>
-      <w:proofErr w:type="spellStart"/>
-      <w:r>
-        <w:rPr>
-          <w:rStyle w:val="IntensiveHervorhebung"/>
-          <w:sz w:val="20"/>
-          <w:szCs w:val="20"/>
-        </w:rPr>
-        <w:t>oereb-checker</w:t>
-      </w:r>
-      <w:proofErr w:type="spellEnd"/>
-      <w:r>
-        <w:rPr>
-          <w:rStyle w:val="IntensiveHervorhebung"/>
-          <w:sz w:val="20"/>
-          <w:szCs w:val="20"/>
-        </w:rPr>
-        <w:t xml:space="preserve"> -</w:t>
-      </w:r>
-      <w:proofErr w:type="spellStart"/>
-      <w:r>
-        <w:rPr>
-          <w:rStyle w:val="IntensiveHervorhebung"/>
-          <w:sz w:val="20"/>
-          <w:szCs w:val="20"/>
-        </w:rPr>
-        <w:t>canton</w:t>
-      </w:r>
-      <w:proofErr w:type="spellEnd"/>
-      <w:r>
-        <w:rPr>
-          <w:rStyle w:val="IntensiveHervorhebung"/>
-          <w:sz w:val="20"/>
-          <w:szCs w:val="20"/>
-        </w:rPr>
-        <w:t xml:space="preserve"> </w:t>
-      </w:r>
-      <w:r>
-        <w:rPr>
-          <w:rStyle w:val="IntensiveHervorhebung"/>
-          <w:sz w:val="20"/>
-          <w:szCs w:val="20"/>
-        </w:rPr>
-        <w:t>BE</w:t>
-      </w:r>
-      <w:r>
-        <w:rPr>
-          <w:rStyle w:val="IntensiveHervorhebung"/>
-          <w:sz w:val="20"/>
-          <w:szCs w:val="20"/>
-        </w:rPr>
-        <w:t xml:space="preserve"> -</w:t>
-      </w:r>
-      <w:proofErr w:type="spellStart"/>
-      <w:r>
-        <w:rPr>
-          <w:rStyle w:val="IntensiveHervorhebung"/>
-          <w:sz w:val="20"/>
-          <w:szCs w:val="20"/>
-        </w:rPr>
-        <w:t>baseurl</w:t>
-      </w:r>
-      <w:proofErr w:type="spellEnd"/>
-      <w:r>
-        <w:rPr>
-          <w:rStyle w:val="IntensiveHervorhebung"/>
-          <w:sz w:val="20"/>
-          <w:szCs w:val="20"/>
-        </w:rPr>
-        <w:t xml:space="preserve"> </w:t>
-      </w:r>
-      <w:r>
-        <w:rPr>
-          <w:rStyle w:val="IntensiveHervorhebung"/>
-          <w:sz w:val="20"/>
-          <w:szCs w:val="20"/>
-        </w:rPr>
-        <w:t xml:space="preserve">https://www.oereb2.apps.be.ch </w:t>
-      </w:r>
-      <w:r>
-        <w:rPr>
-          <w:rStyle w:val="IntensiveHervorhebung"/>
-          <w:sz w:val="20"/>
-          <w:szCs w:val="20"/>
-        </w:rPr>
-        <w:t xml:space="preserve">-type </w:t>
-      </w:r>
-      <w:proofErr w:type="spellStart"/>
-      <w:r>
-        <w:rPr>
-          <w:rStyle w:val="IntensiveHervorhebung"/>
-          <w:sz w:val="20"/>
-          <w:szCs w:val="20"/>
-        </w:rPr>
-        <w:t>GetCapabilities</w:t>
-      </w:r>
-      <w:proofErr w:type="spellEnd"/>
-      <w:r>
-        <w:rPr>
-          <w:rStyle w:val="IntensiveHervorhebung"/>
-          <w:sz w:val="20"/>
-          <w:szCs w:val="20"/>
-        </w:rPr>
-        <w:t xml:space="preserve"> -format </w:t>
-      </w:r>
-      <w:proofErr w:type="spellStart"/>
-      <w:r>
-        <w:rPr>
-          <w:rStyle w:val="IntensiveHervorhebung"/>
-          <w:sz w:val="20"/>
-          <w:szCs w:val="20"/>
-        </w:rPr>
-        <w:t>xml</w:t>
-      </w:r>
-      <w:proofErr w:type="spellEnd"/>
-    </w:p>
-    <w:p>
-      <w:pPr>
-        <w:pStyle w:val="berschrift1"/>
-      </w:pPr>
-      <w:r>
-        <w:t>Umgebungsvariablen</w:t>
-      </w:r>
-    </w:p>
-    <w:p>
-      <w:pPr>
-        <w:pStyle w:val="Listenabsatz"/>
-        <w:numPr>
-          <w:ilvl w:val="0"/>
-          <w:numId w:val="17"/>
-        </w:numPr>
-      </w:pPr>
-      <w:r>
-        <w:rPr>
-          <w:rStyle w:val="IntensiveHervorhebung"/>
-        </w:rPr>
-        <w:t>S3RegionName</w:t>
-      </w:r>
-      <w:r>
-        <w:t>: Name der S3-Region, welche für die S3-Buckets verwendet werden soll (optional)</w:t>
-      </w:r>
-    </w:p>
-    <w:p>
-      <w:pPr>
-        <w:pStyle w:val="Listenabsatz"/>
-        <w:numPr>
-          <w:ilvl w:val="0"/>
-          <w:numId w:val="17"/>
-        </w:numPr>
-      </w:pPr>
-      <w:r>
-        <w:rPr>
-          <w:rStyle w:val="IntensiveHervorhebung"/>
-        </w:rPr>
-        <w:t>S3ResultBucket</w:t>
-      </w:r>
-      <w:r>
-        <w:t>: Name des S3-Bucket für den Upload der Ergebnisse (optional).</w:t>
-      </w:r>
-    </w:p>
-    <w:p>
-      <w:pPr>
-        <w:pStyle w:val="Listenabsatz"/>
-        <w:numPr>
-          <w:ilvl w:val="0"/>
-          <w:numId w:val="17"/>
-        </w:numPr>
-      </w:pPr>
-      <w:r>
-        <w:rPr>
-          <w:rStyle w:val="IntensiveHervorhebung"/>
-        </w:rPr>
-        <w:t>S3ConfigBucket</w:t>
-      </w:r>
-      <w:r>
-        <w:t xml:space="preserve">: Name des S3-Bucket, </w:t>
-      </w:r>
-      <w:r>
-        <w:t>aus den Konfigurationen</w:t>
-      </w:r>
-      <w:r>
-        <w:t xml:space="preserve"> geladen werden sollen (optional).</w:t>
-      </w:r>
-    </w:p>
-    <w:p>
-      <w:pPr>
-        <w:pStyle w:val="Listenabsatz"/>
-        <w:numPr>
-          <w:ilvl w:val="0"/>
-          <w:numId w:val="17"/>
-        </w:numPr>
-      </w:pPr>
-      <w:r>
-        <w:rPr>
-          <w:rStyle w:val="IntensiveHervorhebung"/>
-        </w:rPr>
-        <w:t>S3Config</w:t>
-      </w:r>
-      <w:r>
-        <w:t>: Name</w:t>
-      </w:r>
-      <w:r>
-        <w:t>/Pfad</w:t>
-      </w:r>
-      <w:r>
-        <w:t xml:space="preserve"> de</w:t>
-      </w:r>
-      <w:r>
-        <w:t>r</w:t>
-      </w:r>
-      <w:r>
-        <w:t xml:space="preserve"> </w:t>
-      </w:r>
-      <w:r>
-        <w:t>Konfigurationsdatei</w:t>
-      </w:r>
-      <w:r>
-        <w:t xml:space="preserve">, </w:t>
-      </w:r>
-      <w:r>
-        <w:t xml:space="preserve">welche aus dem </w:t>
-      </w:r>
-      <w:r>
-        <w:rPr>
-          <w:rStyle w:val="IntensiveHervorhebung"/>
-        </w:rPr>
-        <w:t>S3ConfigBucket</w:t>
-      </w:r>
-      <w:r>
-        <w:t xml:space="preserve"> geladen werden sollen (optional).</w:t>
-      </w:r>
-    </w:p>
-    <w:p>
-      <w:pPr>
-        <w:pStyle w:val="Listenabsatz"/>
-      </w:pPr>
     </w:p>
     <w:sectPr>
       <w:pgSz w:w="11906" w:h="16838"/>
@@ -5984,6 +5458,36 @@
       <w:color w:val="5A5A5A" w:themeColor="text1" w:themeTint="A5"/>
     </w:rPr>
   </w:style>
+  <w:style w:type="paragraph" w:styleId="HTMLVorformatiert">
+    <w:name w:val="HTML Preformatted"/>
+    <w:basedOn w:val="Standard"/>
+    <w:link w:val="HTMLVorformatiertZchn"/>
+    <w:uiPriority w:val="99"/>
+    <w:semiHidden/>
+    <w:unhideWhenUsed/>
+    <w:rsid w:val="00F40254"/>
+    <w:pPr>
+      <w:spacing w:after="0" w:line="240" w:lineRule="auto"/>
+    </w:pPr>
+    <w:rPr>
+      <w:rFonts w:ascii="Consolas" w:hAnsi="Consolas"/>
+      <w:sz w:val="20"/>
+      <w:szCs w:val="20"/>
+    </w:rPr>
+  </w:style>
+  <w:style w:type="character" w:customStyle="1" w:styleId="HTMLVorformatiertZchn">
+    <w:name w:val="HTML Vorformatiert Zchn"/>
+    <w:basedOn w:val="Absatz-Standardschriftart"/>
+    <w:link w:val="HTMLVorformatiert"/>
+    <w:uiPriority w:val="99"/>
+    <w:semiHidden/>
+    <w:rsid w:val="00F40254"/>
+    <w:rPr>
+      <w:rFonts w:ascii="Consolas" w:hAnsi="Consolas"/>
+      <w:sz w:val="20"/>
+      <w:szCs w:val="20"/>
+    </w:rPr>
+  </w:style>
 </w:styles>
 </file>
 

</xml_diff>

<commit_message>
improve error reporting and report template - add PDF open/parse failure message (include root cause), standardize validation errors and request creation, add warning as validatormessages and changed some checks results from error to warning, harden federal topic matching for missing IDs, update HTML report template (external CSS, header assets, template version), add GetCapabilities parse error message
</commit_message>
<xml_diff>
--- a/documents/Benutzerhandbuch.docx
+++ b/documents/Benutzerhandbuch.docx
@@ -1116,13 +1116,172 @@
       </w:r>
     </w:p>
     <w:sectPr>
+      <w:headerReference w:type="default" r:id="rId7"/>
       <w:pgSz w:w="11906" w:h="16838"/>
-      <w:pgMar w:top="1417" w:right="1417" w:bottom="1134" w:left="1417" w:header="708" w:footer="708" w:gutter="0"/>
+      <w:pgMar w:top="1417" w:right="1417" w:bottom="1134" w:left="1417" w:header="397" w:footer="708" w:gutter="0"/>
       <w:cols w:space="708"/>
       <w:docGrid w:linePitch="360"/>
     </w:sectPr>
   </w:body>
 </w:document>
+</file>
+
+<file path=word/endnotes.xml><?xml version="1.0" encoding="utf-8"?>
+<w:endnotes xmlns:wpc="http://schemas.microsoft.com/office/word/2010/wordprocessingCanvas" xmlns:cx="http://schemas.microsoft.com/office/drawing/2014/chartex" xmlns:cx1="http://schemas.microsoft.com/office/drawing/2015/9/8/chartex" xmlns:cx2="http://schemas.microsoft.com/office/drawing/2015/10/21/chartex" xmlns:cx3="http://schemas.microsoft.com/office/drawing/2016/5/9/chartex" xmlns:cx4="http://schemas.microsoft.com/office/drawing/2016/5/10/chartex" xmlns:cx5="http://schemas.microsoft.com/office/drawing/2016/5/11/chartex" xmlns:cx6="http://schemas.microsoft.com/office/drawing/2016/5/12/chartex" xmlns:cx7="http://schemas.microsoft.com/office/drawing/2016/5/13/chartex" xmlns:cx8="http://schemas.microsoft.com/office/drawing/2016/5/14/chartex" xmlns:mc="http://schemas.openxmlformats.org/markup-compatibility/2006" xmlns:aink="http://schemas.microsoft.com/office/drawing/2016/ink" xmlns:am3d="http://schemas.microsoft.com/office/drawing/2017/model3d" xmlns:o="urn:schemas-microsoft-com:office:office" xmlns:oel="http://schemas.microsoft.com/office/2019/extlst" xmlns:r="http://schemas.openxmlformats.org/officeDocument/2006/relationships" xmlns:m="http://schemas.openxmlformats.org/officeDocument/2006/math" xmlns:v="urn:schemas-microsoft-com:vml" xmlns:wp14="http://schemas.microsoft.com/office/word/2010/wordprocessingDrawing" xmlns:wp="http://schemas.openxmlformats.org/drawingml/2006/wordprocessingDrawing" xmlns:w10="urn:schemas-microsoft-com:office:word" xmlns:w="http://schemas.openxmlformats.org/wordprocessingml/2006/main" xmlns:w14="http://schemas.microsoft.com/office/word/2010/wordml" xmlns:w15="http://schemas.microsoft.com/office/word/2012/wordml" xmlns:w16cex="http://schemas.microsoft.com/office/word/2018/wordml/cex" xmlns:w16cid="http://schemas.microsoft.com/office/word/2016/wordml/cid" xmlns:w16="http://schemas.microsoft.com/office/word/2018/wordml" xmlns:w16du="http://schemas.microsoft.com/office/word/2023/wordml/word16du" xmlns:w16sdtdh="http://schemas.microsoft.com/office/word/2020/wordml/sdtdatahash" xmlns:w16sdtfl="http://schemas.microsoft.com/office/word/2024/wordml/sdtformatlock" xmlns:w16se="http://schemas.microsoft.com/office/word/2015/wordml/symex" xmlns:wpg="http://schemas.microsoft.com/office/word/2010/wordprocessingGroup" xmlns:wpi="http://schemas.microsoft.com/office/word/2010/wordprocessingInk" xmlns:wne="http://schemas.microsoft.com/office/word/2006/wordml" xmlns:wps="http://schemas.microsoft.com/office/word/2010/wordprocessingShape" mc:Ignorable="w14 w15 w16se w16cid w16 w16cex w16sdtdh w16sdtfl w16du wp14">
+  <w:endnote w:type="separator" w:id="-1">
+    <w:p>
+      <w:pPr>
+        <w:spacing w:after="0" w:line="240" w:lineRule="auto"/>
+      </w:pPr>
+      <w:r>
+        <w:separator/>
+      </w:r>
+    </w:p>
+  </w:endnote>
+  <w:endnote w:type="continuationSeparator" w:id="0">
+    <w:p>
+      <w:pPr>
+        <w:spacing w:after="0" w:line="240" w:lineRule="auto"/>
+      </w:pPr>
+      <w:r>
+        <w:continuationSeparator/>
+      </w:r>
+    </w:p>
+  </w:endnote>
+</w:endnotes>
+</file>
+
+<file path=word/footnotes.xml><?xml version="1.0" encoding="utf-8"?>
+<w:footnotes xmlns:wpc="http://schemas.microsoft.com/office/word/2010/wordprocessingCanvas" xmlns:cx="http://schemas.microsoft.com/office/drawing/2014/chartex" xmlns:cx1="http://schemas.microsoft.com/office/drawing/2015/9/8/chartex" xmlns:cx2="http://schemas.microsoft.com/office/drawing/2015/10/21/chartex" xmlns:cx3="http://schemas.microsoft.com/office/drawing/2016/5/9/chartex" xmlns:cx4="http://schemas.microsoft.com/office/drawing/2016/5/10/chartex" xmlns:cx5="http://schemas.microsoft.com/office/drawing/2016/5/11/chartex" xmlns:cx6="http://schemas.microsoft.com/office/drawing/2016/5/12/chartex" xmlns:cx7="http://schemas.microsoft.com/office/drawing/2016/5/13/chartex" xmlns:cx8="http://schemas.microsoft.com/office/drawing/2016/5/14/chartex" xmlns:mc="http://schemas.openxmlformats.org/markup-compatibility/2006" xmlns:aink="http://schemas.microsoft.com/office/drawing/2016/ink" xmlns:am3d="http://schemas.microsoft.com/office/drawing/2017/model3d" xmlns:o="urn:schemas-microsoft-com:office:office" xmlns:oel="http://schemas.microsoft.com/office/2019/extlst" xmlns:r="http://schemas.openxmlformats.org/officeDocument/2006/relationships" xmlns:m="http://schemas.openxmlformats.org/officeDocument/2006/math" xmlns:v="urn:schemas-microsoft-com:vml" xmlns:wp14="http://schemas.microsoft.com/office/word/2010/wordprocessingDrawing" xmlns:wp="http://schemas.openxmlformats.org/drawingml/2006/wordprocessingDrawing" xmlns:w10="urn:schemas-microsoft-com:office:word" xmlns:w="http://schemas.openxmlformats.org/wordprocessingml/2006/main" xmlns:w14="http://schemas.microsoft.com/office/word/2010/wordml" xmlns:w15="http://schemas.microsoft.com/office/word/2012/wordml" xmlns:w16cex="http://schemas.microsoft.com/office/word/2018/wordml/cex" xmlns:w16cid="http://schemas.microsoft.com/office/word/2016/wordml/cid" xmlns:w16="http://schemas.microsoft.com/office/word/2018/wordml" xmlns:w16du="http://schemas.microsoft.com/office/word/2023/wordml/word16du" xmlns:w16sdtdh="http://schemas.microsoft.com/office/word/2020/wordml/sdtdatahash" xmlns:w16sdtfl="http://schemas.microsoft.com/office/word/2024/wordml/sdtformatlock" xmlns:w16se="http://schemas.microsoft.com/office/word/2015/wordml/symex" xmlns:wpg="http://schemas.microsoft.com/office/word/2010/wordprocessingGroup" xmlns:wpi="http://schemas.microsoft.com/office/word/2010/wordprocessingInk" xmlns:wne="http://schemas.microsoft.com/office/word/2006/wordml" xmlns:wps="http://schemas.microsoft.com/office/word/2010/wordprocessingShape" mc:Ignorable="w14 w15 w16se w16cid w16 w16cex w16sdtdh w16sdtfl w16du wp14">
+  <w:footnote w:type="separator" w:id="-1">
+    <w:p>
+      <w:pPr>
+        <w:spacing w:after="0" w:line="240" w:lineRule="auto"/>
+      </w:pPr>
+      <w:r>
+        <w:separator/>
+      </w:r>
+    </w:p>
+  </w:footnote>
+  <w:footnote w:type="continuationSeparator" w:id="0">
+    <w:p>
+      <w:pPr>
+        <w:spacing w:after="0" w:line="240" w:lineRule="auto"/>
+      </w:pPr>
+      <w:r>
+        <w:continuationSeparator/>
+      </w:r>
+    </w:p>
+  </w:footnote>
+</w:footnotes>
+</file>
+
+<file path=word/header1.xml><?xml version="1.0" encoding="utf-8"?>
+<w:hdr xmlns:wpc="http://schemas.microsoft.com/office/word/2010/wordprocessingCanvas" xmlns:cx="http://schemas.microsoft.com/office/drawing/2014/chartex" xmlns:cx1="http://schemas.microsoft.com/office/drawing/2015/9/8/chartex" xmlns:cx2="http://schemas.microsoft.com/office/drawing/2015/10/21/chartex" xmlns:cx3="http://schemas.microsoft.com/office/drawing/2016/5/9/chartex" xmlns:cx4="http://schemas.microsoft.com/office/drawing/2016/5/10/chartex" xmlns:cx5="http://schemas.microsoft.com/office/drawing/2016/5/11/chartex" xmlns:cx6="http://schemas.microsoft.com/office/drawing/2016/5/12/chartex" xmlns:cx7="http://schemas.microsoft.com/office/drawing/2016/5/13/chartex" xmlns:cx8="http://schemas.microsoft.com/office/drawing/2016/5/14/chartex" xmlns:mc="http://schemas.openxmlformats.org/markup-compatibility/2006" xmlns:aink="http://schemas.microsoft.com/office/drawing/2016/ink" xmlns:am3d="http://schemas.microsoft.com/office/drawing/2017/model3d" xmlns:o="urn:schemas-microsoft-com:office:office" xmlns:oel="http://schemas.microsoft.com/office/2019/extlst" xmlns:r="http://schemas.openxmlformats.org/officeDocument/2006/relationships" xmlns:m="http://schemas.openxmlformats.org/officeDocument/2006/math" xmlns:v="urn:schemas-microsoft-com:vml" xmlns:wp14="http://schemas.microsoft.com/office/word/2010/wordprocessingDrawing" xmlns:wp="http://schemas.openxmlformats.org/drawingml/2006/wordprocessingDrawing" xmlns:w10="urn:schemas-microsoft-com:office:word" xmlns:w="http://schemas.openxmlformats.org/wordprocessingml/2006/main" xmlns:w14="http://schemas.microsoft.com/office/word/2010/wordml" xmlns:w15="http://schemas.microsoft.com/office/word/2012/wordml" xmlns:w16cex="http://schemas.microsoft.com/office/word/2018/wordml/cex" xmlns:w16cid="http://schemas.microsoft.com/office/word/2016/wordml/cid" xmlns:w16="http://schemas.microsoft.com/office/word/2018/wordml" xmlns:w16du="http://schemas.microsoft.com/office/word/2023/wordml/word16du" xmlns:w16sdtdh="http://schemas.microsoft.com/office/word/2020/wordml/sdtdatahash" xmlns:w16sdtfl="http://schemas.microsoft.com/office/word/2024/wordml/sdtformatlock" xmlns:w16se="http://schemas.microsoft.com/office/word/2015/wordml/symex" xmlns:wpg="http://schemas.microsoft.com/office/word/2010/wordprocessingGroup" xmlns:wpi="http://schemas.microsoft.com/office/word/2010/wordprocessingInk" xmlns:wne="http://schemas.microsoft.com/office/word/2006/wordml" xmlns:wps="http://schemas.microsoft.com/office/word/2010/wordprocessingShape" mc:Ignorable="w14 w15 w16se w16cid w16 w16cex w16sdtdh w16sdtfl w16du wp14">
+  <w:p>
+    <w:pPr>
+      <w:pStyle w:val="Kopfzeile"/>
+    </w:pPr>
+    <w:r>
+      <w:rPr>
+        <w:noProof/>
+      </w:rPr>
+      <w:drawing>
+        <wp:inline distT="0" distB="0" distL="0" distR="0" wp14:anchorId="25B82286" wp14:editId="0E50FF4C">
+          <wp:extent cx="1742400" cy="576000"/>
+          <wp:effectExtent l="0" t="0" r="0" b="0"/>
+          <wp:docPr id="1094715047" name="Grafik 3" descr="Ein Bild, das Text, Schrift, Screenshot enthält.&#10;&#10;KI-generierte Inhalte können fehlerhaft sein."/>
+          <wp:cNvGraphicFramePr>
+            <a:graphicFrameLocks xmlns:a="http://schemas.openxmlformats.org/drawingml/2006/main" noChangeAspect="1"/>
+          </wp:cNvGraphicFramePr>
+          <a:graphic xmlns:a="http://schemas.openxmlformats.org/drawingml/2006/main">
+            <a:graphicData uri="http://schemas.openxmlformats.org/drawingml/2006/picture">
+              <pic:pic xmlns:pic="http://schemas.openxmlformats.org/drawingml/2006/picture">
+                <pic:nvPicPr>
+                  <pic:cNvPr id="1094715047" name="Grafik 3" descr="Ein Bild, das Text, Schrift, Screenshot enthält.&#10;&#10;KI-generierte Inhalte können fehlerhaft sein."/>
+                  <pic:cNvPicPr/>
+                </pic:nvPicPr>
+                <pic:blipFill>
+                  <a:blip r:embed="rId1">
+                    <a:extLst>
+                      <a:ext uri="{28A0092B-C50C-407E-A947-70E740481C1C}">
+                        <a14:useLocalDpi xmlns:a14="http://schemas.microsoft.com/office/drawing/2010/main" val="0"/>
+                      </a:ext>
+                    </a:extLst>
+                  </a:blip>
+                  <a:stretch>
+                    <a:fillRect/>
+                  </a:stretch>
+                </pic:blipFill>
+                <pic:spPr>
+                  <a:xfrm>
+                    <a:off x="0" y="0"/>
+                    <a:ext cx="1742400" cy="576000"/>
+                  </a:xfrm>
+                  <a:prstGeom prst="rect">
+                    <a:avLst/>
+                  </a:prstGeom>
+                </pic:spPr>
+              </pic:pic>
+            </a:graphicData>
+          </a:graphic>
+        </wp:inline>
+      </w:drawing>
+    </w:r>
+    <w:r>
+      <w:ptab w:relativeTo="margin" w:alignment="center" w:leader="none"/>
+    </w:r>
+    <w:r>
+      <w:ptab w:relativeTo="margin" w:alignment="right" w:leader="none"/>
+    </w:r>
+    <w:r>
+      <w:rPr>
+        <w:noProof/>
+      </w:rPr>
+      <w:drawing>
+        <wp:inline distT="0" distB="0" distL="0" distR="0" wp14:anchorId="0F2A165D" wp14:editId="545EB12B">
+          <wp:extent cx="1551600" cy="432000"/>
+          <wp:effectExtent l="0" t="0" r="0" b="6350"/>
+          <wp:docPr id="1442680507" name="Grafik 4" descr="Ein Bild, das Text, Schrift, Screenshot, Grafiken enthält.&#10;&#10;KI-generierte Inhalte können fehlerhaft sein."/>
+          <wp:cNvGraphicFramePr>
+            <a:graphicFrameLocks xmlns:a="http://schemas.openxmlformats.org/drawingml/2006/main" noChangeAspect="1"/>
+          </wp:cNvGraphicFramePr>
+          <a:graphic xmlns:a="http://schemas.openxmlformats.org/drawingml/2006/main">
+            <a:graphicData uri="http://schemas.openxmlformats.org/drawingml/2006/picture">
+              <pic:pic xmlns:pic="http://schemas.openxmlformats.org/drawingml/2006/picture">
+                <pic:nvPicPr>
+                  <pic:cNvPr id="1442680507" name="Grafik 4" descr="Ein Bild, das Text, Schrift, Screenshot, Grafiken enthält.&#10;&#10;KI-generierte Inhalte können fehlerhaft sein."/>
+                  <pic:cNvPicPr/>
+                </pic:nvPicPr>
+                <pic:blipFill>
+                  <a:blip r:embed="rId2">
+                    <a:extLst>
+                      <a:ext uri="{28A0092B-C50C-407E-A947-70E740481C1C}">
+                        <a14:useLocalDpi xmlns:a14="http://schemas.microsoft.com/office/drawing/2010/main" val="0"/>
+                      </a:ext>
+                    </a:extLst>
+                  </a:blip>
+                  <a:stretch>
+                    <a:fillRect/>
+                  </a:stretch>
+                </pic:blipFill>
+                <pic:spPr>
+                  <a:xfrm>
+                    <a:off x="0" y="0"/>
+                    <a:ext cx="1551600" cy="432000"/>
+                  </a:xfrm>
+                  <a:prstGeom prst="rect">
+                    <a:avLst/>
+                  </a:prstGeom>
+                </pic:spPr>
+              </pic:pic>
+            </a:graphicData>
+          </a:graphic>
+        </wp:inline>
+      </w:drawing>
+    </w:r>
+  </w:p>
+</w:hdr>
 </file>
 
 <file path=word/numbering.xml><?xml version="1.0" encoding="utf-8"?>
@@ -5488,6 +5647,50 @@
       <w:szCs w:val="20"/>
     </w:rPr>
   </w:style>
+  <w:style w:type="paragraph" w:styleId="Kopfzeile">
+    <w:name w:val="header"/>
+    <w:basedOn w:val="Standard"/>
+    <w:link w:val="KopfzeileZchn"/>
+    <w:uiPriority w:val="99"/>
+    <w:unhideWhenUsed/>
+    <w:rsid w:val="00617060"/>
+    <w:pPr>
+      <w:tabs>
+        <w:tab w:val="center" w:pos="4536"/>
+        <w:tab w:val="right" w:pos="9072"/>
+      </w:tabs>
+      <w:spacing w:after="0" w:line="240" w:lineRule="auto"/>
+    </w:pPr>
+  </w:style>
+  <w:style w:type="character" w:customStyle="1" w:styleId="KopfzeileZchn">
+    <w:name w:val="Kopfzeile Zchn"/>
+    <w:basedOn w:val="Absatz-Standardschriftart"/>
+    <w:link w:val="Kopfzeile"/>
+    <w:uiPriority w:val="99"/>
+    <w:rsid w:val="00617060"/>
+  </w:style>
+  <w:style w:type="paragraph" w:styleId="Fuzeile">
+    <w:name w:val="footer"/>
+    <w:basedOn w:val="Standard"/>
+    <w:link w:val="FuzeileZchn"/>
+    <w:uiPriority w:val="99"/>
+    <w:unhideWhenUsed/>
+    <w:rsid w:val="00617060"/>
+    <w:pPr>
+      <w:tabs>
+        <w:tab w:val="center" w:pos="4536"/>
+        <w:tab w:val="right" w:pos="9072"/>
+      </w:tabs>
+      <w:spacing w:after="0" w:line="240" w:lineRule="auto"/>
+    </w:pPr>
+  </w:style>
+  <w:style w:type="character" w:customStyle="1" w:styleId="FuzeileZchn">
+    <w:name w:val="Fußzeile Zchn"/>
+    <w:basedOn w:val="Absatz-Standardschriftart"/>
+    <w:link w:val="Fuzeile"/>
+    <w:uiPriority w:val="99"/>
+    <w:rsid w:val="00617060"/>
+  </w:style>
 </w:styles>
 </file>
 

</xml_diff>

<commit_message>
UidManager: add PartnerServices client init + basic auth and null-guard, add new envVars 'BFS_UID_PARTNER_LOGIN' and 'BFS_UID_PARTNER_PASSWORD'
</commit_message>
<xml_diff>
--- a/documents/Benutzerhandbuch.docx
+++ b/documents/Benutzerhandbuch.docx
@@ -1116,9 +1116,14 @@
       </w:r>
     </w:p>
     <w:sectPr>
-      <w:headerReference w:type="default" r:id="rId7"/>
+      <w:headerReference w:type="even" r:id="rId7"/>
+      <w:headerReference w:type="default" r:id="rId8"/>
+      <w:footerReference w:type="even" r:id="rId9"/>
+      <w:footerReference w:type="default" r:id="rId10"/>
+      <w:headerReference w:type="first" r:id="rId11"/>
+      <w:footerReference w:type="first" r:id="rId12"/>
       <w:pgSz w:w="11906" w:h="16838"/>
-      <w:pgMar w:top="1417" w:right="1417" w:bottom="1134" w:left="1417" w:header="397" w:footer="708" w:gutter="0"/>
+      <w:pgMar w:top="1701" w:right="1418" w:bottom="1134" w:left="1418" w:header="397" w:footer="709" w:gutter="0"/>
       <w:cols w:space="708"/>
       <w:docGrid w:linePitch="360"/>
     </w:sectPr>
@@ -1151,6 +1156,191 @@
 </w:endnotes>
 </file>
 
+<file path=word/footer1.xml><?xml version="1.0" encoding="utf-8"?>
+<w:ftr xmlns:wpc="http://schemas.microsoft.com/office/word/2010/wordprocessingCanvas" xmlns:cx="http://schemas.microsoft.com/office/drawing/2014/chartex" xmlns:cx1="http://schemas.microsoft.com/office/drawing/2015/9/8/chartex" xmlns:cx2="http://schemas.microsoft.com/office/drawing/2015/10/21/chartex" xmlns:cx3="http://schemas.microsoft.com/office/drawing/2016/5/9/chartex" xmlns:cx4="http://schemas.microsoft.com/office/drawing/2016/5/10/chartex" xmlns:cx5="http://schemas.microsoft.com/office/drawing/2016/5/11/chartex" xmlns:cx6="http://schemas.microsoft.com/office/drawing/2016/5/12/chartex" xmlns:cx7="http://schemas.microsoft.com/office/drawing/2016/5/13/chartex" xmlns:cx8="http://schemas.microsoft.com/office/drawing/2016/5/14/chartex" xmlns:mc="http://schemas.openxmlformats.org/markup-compatibility/2006" xmlns:aink="http://schemas.microsoft.com/office/drawing/2016/ink" xmlns:am3d="http://schemas.microsoft.com/office/drawing/2017/model3d" xmlns:o="urn:schemas-microsoft-com:office:office" xmlns:oel="http://schemas.microsoft.com/office/2019/extlst" xmlns:r="http://schemas.openxmlformats.org/officeDocument/2006/relationships" xmlns:m="http://schemas.openxmlformats.org/officeDocument/2006/math" xmlns:v="urn:schemas-microsoft-com:vml" xmlns:wp14="http://schemas.microsoft.com/office/word/2010/wordprocessingDrawing" xmlns:wp="http://schemas.openxmlformats.org/drawingml/2006/wordprocessingDrawing" xmlns:w10="urn:schemas-microsoft-com:office:word" xmlns:w="http://schemas.openxmlformats.org/wordprocessingml/2006/main" xmlns:w14="http://schemas.microsoft.com/office/word/2010/wordml" xmlns:w15="http://schemas.microsoft.com/office/word/2012/wordml" xmlns:w16cex="http://schemas.microsoft.com/office/word/2018/wordml/cex" xmlns:w16cid="http://schemas.microsoft.com/office/word/2016/wordml/cid" xmlns:w16="http://schemas.microsoft.com/office/word/2018/wordml" xmlns:w16du="http://schemas.microsoft.com/office/word/2023/wordml/word16du" xmlns:w16sdtdh="http://schemas.microsoft.com/office/word/2020/wordml/sdtdatahash" xmlns:w16sdtfl="http://schemas.microsoft.com/office/word/2024/wordml/sdtformatlock" xmlns:w16se="http://schemas.microsoft.com/office/word/2015/wordml/symex" xmlns:wpg="http://schemas.microsoft.com/office/word/2010/wordprocessingGroup" xmlns:wpi="http://schemas.microsoft.com/office/word/2010/wordprocessingInk" xmlns:wne="http://schemas.microsoft.com/office/word/2006/wordml" xmlns:wps="http://schemas.microsoft.com/office/word/2010/wordprocessingShape" mc:Ignorable="w14 w15 w16se w16cid w16 w16cex w16sdtdh w16sdtfl w16du wp14">
+  <w:p>
+    <w:pPr>
+      <w:pStyle w:val="Fuzeile"/>
+    </w:pPr>
+  </w:p>
+</w:ftr>
+</file>
+
+<file path=word/footer2.xml><?xml version="1.0" encoding="utf-8"?>
+<w:ftr xmlns:wpc="http://schemas.microsoft.com/office/word/2010/wordprocessingCanvas" xmlns:cx="http://schemas.microsoft.com/office/drawing/2014/chartex" xmlns:cx1="http://schemas.microsoft.com/office/drawing/2015/9/8/chartex" xmlns:cx2="http://schemas.microsoft.com/office/drawing/2015/10/21/chartex" xmlns:cx3="http://schemas.microsoft.com/office/drawing/2016/5/9/chartex" xmlns:cx4="http://schemas.microsoft.com/office/drawing/2016/5/10/chartex" xmlns:cx5="http://schemas.microsoft.com/office/drawing/2016/5/11/chartex" xmlns:cx6="http://schemas.microsoft.com/office/drawing/2016/5/12/chartex" xmlns:cx7="http://schemas.microsoft.com/office/drawing/2016/5/13/chartex" xmlns:cx8="http://schemas.microsoft.com/office/drawing/2016/5/14/chartex" xmlns:mc="http://schemas.openxmlformats.org/markup-compatibility/2006" xmlns:aink="http://schemas.microsoft.com/office/drawing/2016/ink" xmlns:am3d="http://schemas.microsoft.com/office/drawing/2017/model3d" xmlns:o="urn:schemas-microsoft-com:office:office" xmlns:oel="http://schemas.microsoft.com/office/2019/extlst" xmlns:r="http://schemas.openxmlformats.org/officeDocument/2006/relationships" xmlns:m="http://schemas.openxmlformats.org/officeDocument/2006/math" xmlns:v="urn:schemas-microsoft-com:vml" xmlns:wp14="http://schemas.microsoft.com/office/word/2010/wordprocessingDrawing" xmlns:wp="http://schemas.openxmlformats.org/drawingml/2006/wordprocessingDrawing" xmlns:w10="urn:schemas-microsoft-com:office:word" xmlns:w="http://schemas.openxmlformats.org/wordprocessingml/2006/main" xmlns:w14="http://schemas.microsoft.com/office/word/2010/wordml" xmlns:w15="http://schemas.microsoft.com/office/word/2012/wordml" xmlns:w16cex="http://schemas.microsoft.com/office/word/2018/wordml/cex" xmlns:w16cid="http://schemas.microsoft.com/office/word/2016/wordml/cid" xmlns:w16="http://schemas.microsoft.com/office/word/2018/wordml" xmlns:w16du="http://schemas.microsoft.com/office/word/2023/wordml/word16du" xmlns:w16sdtdh="http://schemas.microsoft.com/office/word/2020/wordml/sdtdatahash" xmlns:w16sdtfl="http://schemas.microsoft.com/office/word/2024/wordml/sdtformatlock" xmlns:w16se="http://schemas.microsoft.com/office/word/2015/wordml/symex" xmlns:wpg="http://schemas.microsoft.com/office/word/2010/wordprocessingGroup" xmlns:wpi="http://schemas.microsoft.com/office/word/2010/wordprocessingInk" xmlns:wne="http://schemas.microsoft.com/office/word/2006/wordml" xmlns:wps="http://schemas.microsoft.com/office/word/2010/wordprocessingShape" mc:Ignorable="w14 w15 w16se w16cid w16 w16cex w16sdtdh w16sdtfl w16du wp14">
+  <w:p>
+    <w:pPr>
+      <w:pStyle w:val="Fuzeile"/>
+      <w:rPr>
+        <w:sz w:val="20"/>
+        <w:szCs w:val="20"/>
+      </w:rPr>
+    </w:pPr>
+    <w:r>
+      <w:rPr>
+        <w:sz w:val="20"/>
+        <w:szCs w:val="20"/>
+      </w:rPr>
+      <w:t>09.02.2026</w:t>
+    </w:r>
+    <w:r>
+      <w:rPr>
+        <w:sz w:val="20"/>
+        <w:szCs w:val="20"/>
+      </w:rPr>
+      <w:ptab w:relativeTo="margin" w:alignment="center" w:leader="none"/>
+    </w:r>
+    <w:r>
+      <w:rPr>
+        <w:sz w:val="20"/>
+        <w:szCs w:val="20"/>
+      </w:rPr>
+      <w:t>Version 0.0.4</w:t>
+    </w:r>
+    <w:r>
+      <w:rPr>
+        <w:sz w:val="20"/>
+        <w:szCs w:val="20"/>
+      </w:rPr>
+      <w:ptab w:relativeTo="margin" w:alignment="right" w:leader="none"/>
+    </w:r>
+    <w:sdt>
+      <w:sdtPr>
+        <w:rPr>
+          <w:sz w:val="20"/>
+          <w:szCs w:val="20"/>
+        </w:rPr>
+        <w:id w:val="687493923"/>
+        <w:docPartObj>
+          <w:docPartGallery w:val="Page Numbers (Bottom of Page)"/>
+          <w:docPartUnique/>
+        </w:docPartObj>
+      </w:sdtPr>
+      <w:sdtContent>
+        <w:sdt>
+          <w:sdtPr>
+            <w:rPr>
+              <w:sz w:val="20"/>
+              <w:szCs w:val="20"/>
+            </w:rPr>
+            <w:id w:val="-1769616900"/>
+            <w:docPartObj>
+              <w:docPartGallery w:val="Page Numbers (Top of Page)"/>
+              <w:docPartUnique/>
+            </w:docPartObj>
+          </w:sdtPr>
+          <w:sdtContent>
+            <w:r>
+              <w:rPr>
+                <w:sz w:val="20"/>
+                <w:szCs w:val="20"/>
+                <w:lang w:val="de-DE"/>
+              </w:rPr>
+              <w:t xml:space="preserve">Seite </w:t>
+            </w:r>
+            <w:r>
+              <w:rPr>
+                <w:sz w:val="20"/>
+                <w:szCs w:val="20"/>
+              </w:rPr>
+              <w:fldChar w:fldCharType="begin"/>
+            </w:r>
+            <w:r>
+              <w:rPr>
+                <w:sz w:val="20"/>
+                <w:szCs w:val="20"/>
+              </w:rPr>
+              <w:instrText>PAGE</w:instrText>
+            </w:r>
+            <w:r>
+              <w:rPr>
+                <w:sz w:val="20"/>
+                <w:szCs w:val="20"/>
+              </w:rPr>
+              <w:fldChar w:fldCharType="separate"/>
+            </w:r>
+            <w:r>
+              <w:rPr>
+                <w:sz w:val="20"/>
+                <w:szCs w:val="20"/>
+              </w:rPr>
+              <w:t>1</w:t>
+            </w:r>
+            <w:r>
+              <w:rPr>
+                <w:sz w:val="20"/>
+                <w:szCs w:val="20"/>
+              </w:rPr>
+              <w:fldChar w:fldCharType="end"/>
+            </w:r>
+            <w:r>
+              <w:rPr>
+                <w:sz w:val="20"/>
+                <w:szCs w:val="20"/>
+                <w:lang w:val="de-DE"/>
+              </w:rPr>
+              <w:t xml:space="preserve"> von </w:t>
+            </w:r>
+            <w:r>
+              <w:rPr>
+                <w:sz w:val="20"/>
+                <w:szCs w:val="20"/>
+              </w:rPr>
+              <w:fldChar w:fldCharType="begin"/>
+            </w:r>
+            <w:r>
+              <w:rPr>
+                <w:sz w:val="20"/>
+                <w:szCs w:val="20"/>
+              </w:rPr>
+              <w:instrText>NUMPAGES</w:instrText>
+            </w:r>
+            <w:r>
+              <w:rPr>
+                <w:sz w:val="20"/>
+                <w:szCs w:val="20"/>
+              </w:rPr>
+              <w:fldChar w:fldCharType="separate"/>
+            </w:r>
+            <w:r>
+              <w:rPr>
+                <w:sz w:val="20"/>
+                <w:szCs w:val="20"/>
+              </w:rPr>
+              <w:t>2</w:t>
+            </w:r>
+            <w:r>
+              <w:rPr>
+                <w:sz w:val="20"/>
+                <w:szCs w:val="20"/>
+              </w:rPr>
+              <w:fldChar w:fldCharType="end"/>
+            </w:r>
+          </w:sdtContent>
+        </w:sdt>
+      </w:sdtContent>
+    </w:sdt>
+    <w:r>
+      <w:rPr>
+        <w:sz w:val="20"/>
+        <w:szCs w:val="20"/>
+      </w:rPr>
+      <w:t xml:space="preserve"> </w:t>
+    </w:r>
+  </w:p>
+</w:ftr>
+</file>
+
+<file path=word/footer3.xml><?xml version="1.0" encoding="utf-8"?>
+<w:ftr xmlns:wpc="http://schemas.microsoft.com/office/word/2010/wordprocessingCanvas" xmlns:cx="http://schemas.microsoft.com/office/drawing/2014/chartex" xmlns:cx1="http://schemas.microsoft.com/office/drawing/2015/9/8/chartex" xmlns:cx2="http://schemas.microsoft.com/office/drawing/2015/10/21/chartex" xmlns:cx3="http://schemas.microsoft.com/office/drawing/2016/5/9/chartex" xmlns:cx4="http://schemas.microsoft.com/office/drawing/2016/5/10/chartex" xmlns:cx5="http://schemas.microsoft.com/office/drawing/2016/5/11/chartex" xmlns:cx6="http://schemas.microsoft.com/office/drawing/2016/5/12/chartex" xmlns:cx7="http://schemas.microsoft.com/office/drawing/2016/5/13/chartex" xmlns:cx8="http://schemas.microsoft.com/office/drawing/2016/5/14/chartex" xmlns:mc="http://schemas.openxmlformats.org/markup-compatibility/2006" xmlns:aink="http://schemas.microsoft.com/office/drawing/2016/ink" xmlns:am3d="http://schemas.microsoft.com/office/drawing/2017/model3d" xmlns:o="urn:schemas-microsoft-com:office:office" xmlns:oel="http://schemas.microsoft.com/office/2019/extlst" xmlns:r="http://schemas.openxmlformats.org/officeDocument/2006/relationships" xmlns:m="http://schemas.openxmlformats.org/officeDocument/2006/math" xmlns:v="urn:schemas-microsoft-com:vml" xmlns:wp14="http://schemas.microsoft.com/office/word/2010/wordprocessingDrawing" xmlns:wp="http://schemas.openxmlformats.org/drawingml/2006/wordprocessingDrawing" xmlns:w10="urn:schemas-microsoft-com:office:word" xmlns:w="http://schemas.openxmlformats.org/wordprocessingml/2006/main" xmlns:w14="http://schemas.microsoft.com/office/word/2010/wordml" xmlns:w15="http://schemas.microsoft.com/office/word/2012/wordml" xmlns:w16cex="http://schemas.microsoft.com/office/word/2018/wordml/cex" xmlns:w16cid="http://schemas.microsoft.com/office/word/2016/wordml/cid" xmlns:w16="http://schemas.microsoft.com/office/word/2018/wordml" xmlns:w16du="http://schemas.microsoft.com/office/word/2023/wordml/word16du" xmlns:w16sdtdh="http://schemas.microsoft.com/office/word/2020/wordml/sdtdatahash" xmlns:w16sdtfl="http://schemas.microsoft.com/office/word/2024/wordml/sdtformatlock" xmlns:w16se="http://schemas.microsoft.com/office/word/2015/wordml/symex" xmlns:wpg="http://schemas.microsoft.com/office/word/2010/wordprocessingGroup" xmlns:wpi="http://schemas.microsoft.com/office/word/2010/wordprocessingInk" xmlns:wne="http://schemas.microsoft.com/office/word/2006/wordml" xmlns:wps="http://schemas.microsoft.com/office/word/2010/wordprocessingShape" mc:Ignorable="w14 w15 w16se w16cid w16 w16cex w16sdtdh w16sdtfl w16du wp14">
+  <w:p>
+    <w:pPr>
+      <w:pStyle w:val="Fuzeile"/>
+    </w:pPr>
+  </w:p>
+</w:ftr>
+</file>
+
 <file path=word/footnotes.xml><?xml version="1.0" encoding="utf-8"?>
 <w:footnotes xmlns:wpc="http://schemas.microsoft.com/office/word/2010/wordprocessingCanvas" xmlns:cx="http://schemas.microsoft.com/office/drawing/2014/chartex" xmlns:cx1="http://schemas.microsoft.com/office/drawing/2015/9/8/chartex" xmlns:cx2="http://schemas.microsoft.com/office/drawing/2015/10/21/chartex" xmlns:cx3="http://schemas.microsoft.com/office/drawing/2016/5/9/chartex" xmlns:cx4="http://schemas.microsoft.com/office/drawing/2016/5/10/chartex" xmlns:cx5="http://schemas.microsoft.com/office/drawing/2016/5/11/chartex" xmlns:cx6="http://schemas.microsoft.com/office/drawing/2016/5/12/chartex" xmlns:cx7="http://schemas.microsoft.com/office/drawing/2016/5/13/chartex" xmlns:cx8="http://schemas.microsoft.com/office/drawing/2016/5/14/chartex" xmlns:mc="http://schemas.openxmlformats.org/markup-compatibility/2006" xmlns:aink="http://schemas.microsoft.com/office/drawing/2016/ink" xmlns:am3d="http://schemas.microsoft.com/office/drawing/2017/model3d" xmlns:o="urn:schemas-microsoft-com:office:office" xmlns:oel="http://schemas.microsoft.com/office/2019/extlst" xmlns:r="http://schemas.openxmlformats.org/officeDocument/2006/relationships" xmlns:m="http://schemas.openxmlformats.org/officeDocument/2006/math" xmlns:v="urn:schemas-microsoft-com:vml" xmlns:wp14="http://schemas.microsoft.com/office/word/2010/wordprocessingDrawing" xmlns:wp="http://schemas.openxmlformats.org/drawingml/2006/wordprocessingDrawing" xmlns:w10="urn:schemas-microsoft-com:office:word" xmlns:w="http://schemas.openxmlformats.org/wordprocessingml/2006/main" xmlns:w14="http://schemas.microsoft.com/office/word/2010/wordml" xmlns:w15="http://schemas.microsoft.com/office/word/2012/wordml" xmlns:w16cex="http://schemas.microsoft.com/office/word/2018/wordml/cex" xmlns:w16cid="http://schemas.microsoft.com/office/word/2016/wordml/cid" xmlns:w16="http://schemas.microsoft.com/office/word/2018/wordml" xmlns:w16du="http://schemas.microsoft.com/office/word/2023/wordml/word16du" xmlns:w16sdtdh="http://schemas.microsoft.com/office/word/2020/wordml/sdtdatahash" xmlns:w16sdtfl="http://schemas.microsoft.com/office/word/2024/wordml/sdtformatlock" xmlns:w16se="http://schemas.microsoft.com/office/word/2015/wordml/symex" xmlns:wpg="http://schemas.microsoft.com/office/word/2010/wordprocessingGroup" xmlns:wpi="http://schemas.microsoft.com/office/word/2010/wordprocessingInk" xmlns:wne="http://schemas.microsoft.com/office/word/2006/wordml" xmlns:wps="http://schemas.microsoft.com/office/word/2010/wordprocessingShape" mc:Ignorable="w14 w15 w16se w16cid w16 w16cex w16sdtdh w16sdtfl w16du wp14">
   <w:footnote w:type="separator" w:id="-1">
@@ -1177,6 +1367,16 @@
 </file>
 
 <file path=word/header1.xml><?xml version="1.0" encoding="utf-8"?>
+<w:hdr xmlns:wpc="http://schemas.microsoft.com/office/word/2010/wordprocessingCanvas" xmlns:cx="http://schemas.microsoft.com/office/drawing/2014/chartex" xmlns:cx1="http://schemas.microsoft.com/office/drawing/2015/9/8/chartex" xmlns:cx2="http://schemas.microsoft.com/office/drawing/2015/10/21/chartex" xmlns:cx3="http://schemas.microsoft.com/office/drawing/2016/5/9/chartex" xmlns:cx4="http://schemas.microsoft.com/office/drawing/2016/5/10/chartex" xmlns:cx5="http://schemas.microsoft.com/office/drawing/2016/5/11/chartex" xmlns:cx6="http://schemas.microsoft.com/office/drawing/2016/5/12/chartex" xmlns:cx7="http://schemas.microsoft.com/office/drawing/2016/5/13/chartex" xmlns:cx8="http://schemas.microsoft.com/office/drawing/2016/5/14/chartex" xmlns:mc="http://schemas.openxmlformats.org/markup-compatibility/2006" xmlns:aink="http://schemas.microsoft.com/office/drawing/2016/ink" xmlns:am3d="http://schemas.microsoft.com/office/drawing/2017/model3d" xmlns:o="urn:schemas-microsoft-com:office:office" xmlns:oel="http://schemas.microsoft.com/office/2019/extlst" xmlns:r="http://schemas.openxmlformats.org/officeDocument/2006/relationships" xmlns:m="http://schemas.openxmlformats.org/officeDocument/2006/math" xmlns:v="urn:schemas-microsoft-com:vml" xmlns:wp14="http://schemas.microsoft.com/office/word/2010/wordprocessingDrawing" xmlns:wp="http://schemas.openxmlformats.org/drawingml/2006/wordprocessingDrawing" xmlns:w10="urn:schemas-microsoft-com:office:word" xmlns:w="http://schemas.openxmlformats.org/wordprocessingml/2006/main" xmlns:w14="http://schemas.microsoft.com/office/word/2010/wordml" xmlns:w15="http://schemas.microsoft.com/office/word/2012/wordml" xmlns:w16cex="http://schemas.microsoft.com/office/word/2018/wordml/cex" xmlns:w16cid="http://schemas.microsoft.com/office/word/2016/wordml/cid" xmlns:w16="http://schemas.microsoft.com/office/word/2018/wordml" xmlns:w16du="http://schemas.microsoft.com/office/word/2023/wordml/word16du" xmlns:w16sdtdh="http://schemas.microsoft.com/office/word/2020/wordml/sdtdatahash" xmlns:w16sdtfl="http://schemas.microsoft.com/office/word/2024/wordml/sdtformatlock" xmlns:w16se="http://schemas.microsoft.com/office/word/2015/wordml/symex" xmlns:wpg="http://schemas.microsoft.com/office/word/2010/wordprocessingGroup" xmlns:wpi="http://schemas.microsoft.com/office/word/2010/wordprocessingInk" xmlns:wne="http://schemas.microsoft.com/office/word/2006/wordml" xmlns:wps="http://schemas.microsoft.com/office/word/2010/wordprocessingShape" mc:Ignorable="w14 w15 w16se w16cid w16 w16cex w16sdtdh w16sdtfl w16du wp14">
+  <w:p>
+    <w:pPr>
+      <w:pStyle w:val="Kopfzeile"/>
+    </w:pPr>
+  </w:p>
+</w:hdr>
+</file>
+
+<file path=word/header2.xml><?xml version="1.0" encoding="utf-8"?>
 <w:hdr xmlns:wpc="http://schemas.microsoft.com/office/word/2010/wordprocessingCanvas" xmlns:cx="http://schemas.microsoft.com/office/drawing/2014/chartex" xmlns:cx1="http://schemas.microsoft.com/office/drawing/2015/9/8/chartex" xmlns:cx2="http://schemas.microsoft.com/office/drawing/2015/10/21/chartex" xmlns:cx3="http://schemas.microsoft.com/office/drawing/2016/5/9/chartex" xmlns:cx4="http://schemas.microsoft.com/office/drawing/2016/5/10/chartex" xmlns:cx5="http://schemas.microsoft.com/office/drawing/2016/5/11/chartex" xmlns:cx6="http://schemas.microsoft.com/office/drawing/2016/5/12/chartex" xmlns:cx7="http://schemas.microsoft.com/office/drawing/2016/5/13/chartex" xmlns:cx8="http://schemas.microsoft.com/office/drawing/2016/5/14/chartex" xmlns:mc="http://schemas.openxmlformats.org/markup-compatibility/2006" xmlns:aink="http://schemas.microsoft.com/office/drawing/2016/ink" xmlns:am3d="http://schemas.microsoft.com/office/drawing/2017/model3d" xmlns:o="urn:schemas-microsoft-com:office:office" xmlns:oel="http://schemas.microsoft.com/office/2019/extlst" xmlns:r="http://schemas.openxmlformats.org/officeDocument/2006/relationships" xmlns:m="http://schemas.openxmlformats.org/officeDocument/2006/math" xmlns:v="urn:schemas-microsoft-com:vml" xmlns:wp14="http://schemas.microsoft.com/office/word/2010/wordprocessingDrawing" xmlns:wp="http://schemas.openxmlformats.org/drawingml/2006/wordprocessingDrawing" xmlns:w10="urn:schemas-microsoft-com:office:word" xmlns:w="http://schemas.openxmlformats.org/wordprocessingml/2006/main" xmlns:w14="http://schemas.microsoft.com/office/word/2010/wordml" xmlns:w15="http://schemas.microsoft.com/office/word/2012/wordml" xmlns:w16cex="http://schemas.microsoft.com/office/word/2018/wordml/cex" xmlns:w16cid="http://schemas.microsoft.com/office/word/2016/wordml/cid" xmlns:w16="http://schemas.microsoft.com/office/word/2018/wordml" xmlns:w16du="http://schemas.microsoft.com/office/word/2023/wordml/word16du" xmlns:w16sdtdh="http://schemas.microsoft.com/office/word/2020/wordml/sdtdatahash" xmlns:w16sdtfl="http://schemas.microsoft.com/office/word/2024/wordml/sdtformatlock" xmlns:w16se="http://schemas.microsoft.com/office/word/2015/wordml/symex" xmlns:wpg="http://schemas.microsoft.com/office/word/2010/wordprocessingGroup" xmlns:wpi="http://schemas.microsoft.com/office/word/2010/wordprocessingInk" xmlns:wne="http://schemas.microsoft.com/office/word/2006/wordml" xmlns:wps="http://schemas.microsoft.com/office/word/2010/wordprocessingShape" mc:Ignorable="w14 w15 w16se w16cid w16 w16cex w16sdtdh w16sdtfl w16du wp14">
   <w:p>
     <w:pPr>
@@ -1280,6 +1480,16 @@
         </wp:inline>
       </w:drawing>
     </w:r>
+  </w:p>
+</w:hdr>
+</file>
+
+<file path=word/header3.xml><?xml version="1.0" encoding="utf-8"?>
+<w:hdr xmlns:wpc="http://schemas.microsoft.com/office/word/2010/wordprocessingCanvas" xmlns:cx="http://schemas.microsoft.com/office/drawing/2014/chartex" xmlns:cx1="http://schemas.microsoft.com/office/drawing/2015/9/8/chartex" xmlns:cx2="http://schemas.microsoft.com/office/drawing/2015/10/21/chartex" xmlns:cx3="http://schemas.microsoft.com/office/drawing/2016/5/9/chartex" xmlns:cx4="http://schemas.microsoft.com/office/drawing/2016/5/10/chartex" xmlns:cx5="http://schemas.microsoft.com/office/drawing/2016/5/11/chartex" xmlns:cx6="http://schemas.microsoft.com/office/drawing/2016/5/12/chartex" xmlns:cx7="http://schemas.microsoft.com/office/drawing/2016/5/13/chartex" xmlns:cx8="http://schemas.microsoft.com/office/drawing/2016/5/14/chartex" xmlns:mc="http://schemas.openxmlformats.org/markup-compatibility/2006" xmlns:aink="http://schemas.microsoft.com/office/drawing/2016/ink" xmlns:am3d="http://schemas.microsoft.com/office/drawing/2017/model3d" xmlns:o="urn:schemas-microsoft-com:office:office" xmlns:oel="http://schemas.microsoft.com/office/2019/extlst" xmlns:r="http://schemas.openxmlformats.org/officeDocument/2006/relationships" xmlns:m="http://schemas.openxmlformats.org/officeDocument/2006/math" xmlns:v="urn:schemas-microsoft-com:vml" xmlns:wp14="http://schemas.microsoft.com/office/word/2010/wordprocessingDrawing" xmlns:wp="http://schemas.openxmlformats.org/drawingml/2006/wordprocessingDrawing" xmlns:w10="urn:schemas-microsoft-com:office:word" xmlns:w="http://schemas.openxmlformats.org/wordprocessingml/2006/main" xmlns:w14="http://schemas.microsoft.com/office/word/2010/wordml" xmlns:w15="http://schemas.microsoft.com/office/word/2012/wordml" xmlns:w16cex="http://schemas.microsoft.com/office/word/2018/wordml/cex" xmlns:w16cid="http://schemas.microsoft.com/office/word/2016/wordml/cid" xmlns:w16="http://schemas.microsoft.com/office/word/2018/wordml" xmlns:w16du="http://schemas.microsoft.com/office/word/2023/wordml/word16du" xmlns:w16sdtdh="http://schemas.microsoft.com/office/word/2020/wordml/sdtdatahash" xmlns:w16sdtfl="http://schemas.microsoft.com/office/word/2024/wordml/sdtformatlock" xmlns:w16se="http://schemas.microsoft.com/office/word/2015/wordml/symex" xmlns:wpg="http://schemas.microsoft.com/office/word/2010/wordprocessingGroup" xmlns:wpi="http://schemas.microsoft.com/office/word/2010/wordprocessingInk" xmlns:wne="http://schemas.microsoft.com/office/word/2006/wordml" xmlns:wps="http://schemas.microsoft.com/office/word/2010/wordprocessingShape" mc:Ignorable="w14 w15 w16se w16cid w16 w16cex w16sdtdh w16sdtfl w16du wp14">
+  <w:p>
+    <w:pPr>
+      <w:pStyle w:val="Kopfzeile"/>
+    </w:pPr>
   </w:p>
 </w:hdr>
 </file>

</xml_diff>